<commit_message>
Fix PDF and DOCX formatting: table layout, heading sizing, subtitle centering
PDF: full-width architecture table (1.4in + 1fr), subtle 0.3pt outlines,
14pt heading for long section title to fit one line, contact font 9.5pt.
DOCX: center subtitle, bold table headers, 25/75 column split.

Co-Authored-By: Claude Opus 4.6 <noreply@anthropic.com>
</commit_message>
<xml_diff>
--- a/reference.docx
+++ b/reference.docx
@@ -174,7 +174,7 @@
 </file>
 
 <file path=word/styles.xml><?xml version="1.0" encoding="utf-8"?>
-<w:styles xmlns:mc="http://schemas.openxmlformats.org/markup-compatibility/2006" xmlns:r="http://schemas.openxmlformats.org/officeDocument/2006/relationships" xmlns:w="http://schemas.openxmlformats.org/wordprocessingml/2006/main" xmlns:w14="http://schemas.microsoft.com/office/word/2010/wordml" xmlns:w15="http://schemas.microsoft.com/office/word/2012/wordml" mc:Ignorable="w14 w15">
+<w:styles xmlns:ns1="http://schemas.openxmlformats.org/markup-compatibility/2006" xmlns:w="http://schemas.openxmlformats.org/wordprocessingml/2006/main" ns1:Ignorable="w14 w15">
   <w:docDefaults>
     <w:rPrDefault>
       <w:rPr>
@@ -447,5 +447,16 @@
       <w:szCs w:val="22"/>
     </w:rPr>
   </w:style>
+  <w:style w:type="paragraph" w:styleId="Subtitle">
+    <w:name w:val="Subtitle"/>
+    <w:pPr>
+      <w:jc w:val="center"/>
+      <w:spacing w:before="0" w:after="60"/>
+    </w:pPr>
+    <w:rPr>
+      <w:color w:val="555555"/>
+      <w:sz w:val="24"/>
+    </w:rPr>
+  </w:style>
 </w:styles>
 </file>
</xml_diff>

<commit_message>
Fix DOCX template: rebuild reference.docx to resolve unreadable content warning
Previous programmatic XML edit corrupted the template. Rebuilt cleanly
from backup with proper Subtitle style definition via python-docx API.

Co-Authored-By: Claude Opus 4.6 <noreply@anthropic.com>
</commit_message>
<xml_diff>
--- a/reference.docx
+++ b/reference.docx
@@ -174,7 +174,7 @@
 </file>
 
 <file path=word/styles.xml><?xml version="1.0" encoding="utf-8"?>
-<w:styles xmlns:ns1="http://schemas.openxmlformats.org/markup-compatibility/2006" xmlns:w="http://schemas.openxmlformats.org/wordprocessingml/2006/main" ns1:Ignorable="w14 w15">
+<w:styles xmlns:mc="http://schemas.openxmlformats.org/markup-compatibility/2006" xmlns:w="http://schemas.openxmlformats.org/wordprocessingml/2006/main" mc:Ignorable="w14 w15">
   <w:docDefaults>
     <w:rPrDefault>
       <w:rPr>
@@ -449,9 +449,10 @@
   </w:style>
   <w:style w:type="paragraph" w:styleId="Subtitle">
     <w:name w:val="Subtitle"/>
+    <w:basedOn w:val="Normal"/>
     <w:pPr>
       <w:jc w:val="center"/>
-      <w:spacing w:before="0" w:after="60"/>
+      <w:spacing w:after="60"/>
     </w:pPr>
     <w:rPr>
       <w:color w:val="555555"/>

</xml_diff>

<commit_message>
Fix DOCX template: rebuild Subtitle style via python-docx API
Previous raw XML edit caused Word "unreadable content" warning.
Rebuilt from clean backup using python-docx add_style() API instead.

Co-Authored-By: Claude Opus 4.6 <noreply@anthropic.com>
</commit_message>
<xml_diff>
--- a/reference.docx
+++ b/reference.docx
@@ -174,7 +174,7 @@
 </file>
 
 <file path=word/styles.xml><?xml version="1.0" encoding="utf-8"?>
-<w:styles xmlns:mc="http://schemas.openxmlformats.org/markup-compatibility/2006" xmlns:w="http://schemas.openxmlformats.org/wordprocessingml/2006/main" mc:Ignorable="w14 w15">
+<w:styles xmlns:mc="http://schemas.openxmlformats.org/markup-compatibility/2006" xmlns:r="http://schemas.openxmlformats.org/officeDocument/2006/relationships" xmlns:w="http://schemas.openxmlformats.org/wordprocessingml/2006/main" xmlns:w14="http://schemas.microsoft.com/office/word/2010/wordml" xmlns:w15="http://schemas.microsoft.com/office/word/2012/wordml" mc:Ignorable="w14 w15">
   <w:docDefaults>
     <w:rPrDefault>
       <w:rPr>
@@ -447,12 +447,12 @@
       <w:szCs w:val="22"/>
     </w:rPr>
   </w:style>
-  <w:style w:type="paragraph" w:styleId="Subtitle">
+  <w:style w:type="paragraph" w:customStyle="1" w:styleId="Subtitle">
     <w:name w:val="Subtitle"/>
     <w:basedOn w:val="Normal"/>
     <w:pPr>
+      <w:spacing w:after="60"/>
       <w:jc w:val="center"/>
-      <w:spacing w:after="60"/>
     </w:pPr>
     <w:rPr>
       <w:color w:val="555555"/>

</xml_diff>